<commit_message>
feat: add system and user prompt templates for JSON compliance in BRD specifications
</commit_message>
<xml_diff>
--- a/BRD_Template.docx
+++ b/BRD_Template.docx
@@ -89,14 +89,7 @@
           <w:b/>
           <w:bCs/>
         </w:rPr>
-        <w:t>I</w:t>
-      </w:r>
-      <w:r>
-        <w:rPr>
-          <w:b/>
-          <w:bCs/>
-        </w:rPr>
-        <w:t>D:</w:t>
+        <w:t>ID:</w:t>
       </w:r>
       <w:r>
         <w:rPr/>
@@ -177,7 +170,7 @@
       </w:tblPr>
       <w:tblGrid>
         <w:gridCol w:w="4620"/>
-        <w:gridCol w:w="4620"/>
+        <w:gridCol w:w="4619"/>
       </w:tblGrid>
       <w:tr>
         <w:trPr/>
@@ -187,6 +180,7 @@
             <w:tcBorders>
               <w:top w:val="single" w:sz="4" w:space="0" w:color="000000"/>
               <w:left w:val="single" w:sz="4" w:space="0" w:color="000000"/>
+              <w:bottom w:val="single" w:sz="4" w:space="0" w:color="000000"/>
             </w:tcBorders>
           </w:tcPr>
           <w:p>
@@ -203,9 +197,11 @@
         </w:tc>
         <w:tc>
           <w:tcPr>
-            <w:tcW w:w="4620" w:type="dxa"/>
+            <w:tcW w:w="4619" w:type="dxa"/>
             <w:tcBorders>
               <w:top w:val="single" w:sz="4" w:space="0" w:color="000000"/>
+              <w:left w:val="single" w:sz="4" w:space="0" w:color="000000"/>
+              <w:bottom w:val="single" w:sz="4" w:space="0" w:color="000000"/>
               <w:right w:val="single" w:sz="4" w:space="0" w:color="000000"/>
             </w:tcBorders>
           </w:tcPr>
@@ -240,22 +236,15 @@
             </w:pPr>
             <w:r>
               <w:rPr/>
-              <w:t>{</w:t>
-            </w:r>
-            <w:r>
-              <w:rPr/>
-              <w:t>serial_number</w:t>
-            </w:r>
-            <w:r>
-              <w:rPr/>
-              <w:t>}</w:t>
-            </w:r>
-          </w:p>
-        </w:tc>
-        <w:tc>
-          <w:tcPr>
-            <w:tcW w:w="4620" w:type="dxa"/>
-            <w:tcBorders>
+              <w:t>{serial_number}</w:t>
+            </w:r>
+          </w:p>
+        </w:tc>
+        <w:tc>
+          <w:tcPr>
+            <w:tcW w:w="4619" w:type="dxa"/>
+            <w:tcBorders>
+              <w:left w:val="single" w:sz="4" w:space="0" w:color="000000"/>
               <w:bottom w:val="single" w:sz="4" w:space="0" w:color="000000"/>
               <w:right w:val="single" w:sz="4" w:space="0" w:color="000000"/>
             </w:tcBorders>
@@ -268,15 +257,7 @@
             </w:pPr>
             <w:r>
               <w:rPr/>
-              <w:t>{</w:t>
-            </w:r>
-            <w:r>
-              <w:rPr/>
-              <w:t>description</w:t>
-            </w:r>
-            <w:r>
-              <w:rPr/>
-              <w:t>}</w:t>
+              <w:t>{description}</w:t>
             </w:r>
           </w:p>
         </w:tc>
@@ -583,7 +564,7 @@
       <w:tblGrid>
         <w:gridCol w:w="2234"/>
         <w:gridCol w:w="3269"/>
-        <w:gridCol w:w="3126"/>
+        <w:gridCol w:w="3127"/>
       </w:tblGrid>
       <w:tr>
         <w:trPr/>
@@ -638,7 +619,7 @@
         </w:tc>
         <w:tc>
           <w:tcPr>
-            <w:tcW w:w="3126" w:type="dxa"/>
+            <w:tcW w:w="3127" w:type="dxa"/>
             <w:tcBorders>
               <w:top w:val="single" w:sz="8" w:space="0" w:color="000000"/>
               <w:bottom w:val="single" w:sz="8" w:space="0" w:color="000000"/>
@@ -712,7 +693,7 @@
         </w:tc>
         <w:tc>
           <w:tcPr>
-            <w:tcW w:w="3126" w:type="dxa"/>
+            <w:tcW w:w="3127" w:type="dxa"/>
             <w:tcBorders>
               <w:bottom w:val="single" w:sz="8" w:space="0" w:color="000000"/>
               <w:right w:val="single" w:sz="8" w:space="0" w:color="000000"/>
@@ -729,6 +710,7 @@
             </w:pPr>
             <w:r>
               <w:rPr/>
+              <w:t>{date_today}</w:t>
             </w:r>
           </w:p>
         </w:tc>
@@ -782,7 +764,7 @@
         </w:tc>
         <w:tc>
           <w:tcPr>
-            <w:tcW w:w="3126" w:type="dxa"/>
+            <w:tcW w:w="3127" w:type="dxa"/>
             <w:tcBorders>
               <w:bottom w:val="single" w:sz="8" w:space="0" w:color="000000"/>
               <w:right w:val="single" w:sz="8" w:space="0" w:color="000000"/>
@@ -1488,6 +1470,7 @@
             <w:tcW w:w="4950" w:type="dxa"/>
             <w:tcBorders>
               <w:top w:val="single" w:sz="4" w:space="0" w:color="000000"/>
+              <w:left w:val="single" w:sz="4" w:space="0" w:color="000000"/>
               <w:bottom w:val="single" w:sz="4" w:space="0" w:color="000000"/>
               <w:right w:val="single" w:sz="4" w:space="0" w:color="000000"/>
             </w:tcBorders>
@@ -1531,6 +1514,7 @@
           <w:tcPr>
             <w:tcW w:w="4950" w:type="dxa"/>
             <w:tcBorders>
+              <w:left w:val="single" w:sz="4" w:space="0" w:color="000000"/>
               <w:bottom w:val="single" w:sz="4" w:space="0" w:color="000000"/>
               <w:right w:val="single" w:sz="4" w:space="0" w:color="000000"/>
             </w:tcBorders>
@@ -1574,6 +1558,7 @@
           <w:tcPr>
             <w:tcW w:w="4950" w:type="dxa"/>
             <w:tcBorders>
+              <w:left w:val="single" w:sz="4" w:space="0" w:color="000000"/>
               <w:bottom w:val="single" w:sz="4" w:space="0" w:color="000000"/>
               <w:right w:val="single" w:sz="4" w:space="0" w:color="000000"/>
             </w:tcBorders>
@@ -1617,6 +1602,7 @@
           <w:tcPr>
             <w:tcW w:w="4950" w:type="dxa"/>
             <w:tcBorders>
+              <w:left w:val="single" w:sz="4" w:space="0" w:color="000000"/>
               <w:bottom w:val="single" w:sz="4" w:space="0" w:color="000000"/>
               <w:right w:val="single" w:sz="4" w:space="0" w:color="000000"/>
             </w:tcBorders>
@@ -1660,6 +1646,7 @@
           <w:tcPr>
             <w:tcW w:w="4950" w:type="dxa"/>
             <w:tcBorders>
+              <w:left w:val="single" w:sz="4" w:space="0" w:color="000000"/>
               <w:bottom w:val="single" w:sz="4" w:space="0" w:color="000000"/>
               <w:right w:val="single" w:sz="4" w:space="0" w:color="000000"/>
             </w:tcBorders>

</xml_diff>

<commit_message>
update BRD template and schema to include open questions and contradictions
</commit_message>
<xml_diff>
--- a/BRD_Template.docx
+++ b/BRD_Template.docx
@@ -2133,6 +2133,81 @@
       <w:r>
         <w:rPr/>
         <w:t xml:space="preserve"> {training_requirement}</w:t>
+      </w:r>
+    </w:p>
+    <w:p>
+      <w:pPr>
+        <w:pStyle w:val="Normal"/>
+        <w:rPr/>
+      </w:pPr>
+      <w:r>
+        <w:rPr/>
+      </w:r>
+    </w:p>
+    <w:p>
+      <w:pPr>
+        <w:pStyle w:val="Normal"/>
+        <w:rPr/>
+      </w:pPr>
+      <w:r>
+        <w:rPr>
+          <w:b/>
+          <w:bCs/>
+        </w:rPr>
+        <w:t>Open Questions:</w:t>
+      </w:r>
+      <w:r>
+        <w:rPr/>
+        <w:t xml:space="preserve"> {open_questions}</w:t>
+      </w:r>
+    </w:p>
+    <w:p>
+      <w:pPr>
+        <w:pStyle w:val="Normal"/>
+        <w:rPr/>
+      </w:pPr>
+      <w:r>
+        <w:rPr/>
+      </w:r>
+    </w:p>
+    <w:p>
+      <w:pPr>
+        <w:pStyle w:val="Normal"/>
+        <w:rPr/>
+      </w:pPr>
+      <w:r>
+        <w:rPr>
+          <w:b/>
+          <w:bCs/>
+        </w:rPr>
+        <w:t>Contradictions (if any):</w:t>
+      </w:r>
+      <w:r>
+        <w:rPr/>
+        <w:t xml:space="preserve"> {contradictions_found_in_input_documents}</w:t>
+      </w:r>
+    </w:p>
+    <w:p>
+      <w:pPr>
+        <w:pStyle w:val="Normal"/>
+        <w:rPr>
+          <w:rFonts w:ascii="Consolas;Courier New;monospace" w:hAnsi="Consolas;Courier New;monospace"/>
+          <w:b w:val="false"/>
+          <w:color w:val="CE9178"/>
+          <w:sz w:val="24"/>
+          <w:szCs w:val="24"/>
+          <w:shd w:fill="1F1F1F" w:val="clear"/>
+        </w:rPr>
+      </w:pPr>
+      <w:r>
+        <w:rPr>
+          <w:rFonts w:ascii="Consolas;Courier New;monospace" w:hAnsi="Consolas;Courier New;monospace"/>
+          <w:b w:val="false"/>
+          <w:color w:val="CE9178"/>
+          <w:sz w:val="24"/>
+          <w:szCs w:val="24"/>
+          <w:shd w:fill="1F1F1F" w:val="clear"/>
+        </w:rPr>
       </w:r>
     </w:p>
     <w:p>

</xml_diff>

<commit_message>
update BRD template and user prompt for improved structure and clarity. Json schema description added
</commit_message>
<xml_diff>
--- a/BRD_Template.docx
+++ b/BRD_Template.docx
@@ -1427,9 +1427,9 @@
     </w:p>
     <w:tbl>
       <w:tblPr>
-        <w:tblW w:w="8520" w:type="dxa"/>
+        <w:tblW w:w="9417" w:type="dxa"/>
         <w:jc w:val="left"/>
-        <w:tblInd w:w="-5" w:type="dxa"/>
+        <w:tblInd w:w="55" w:type="dxa"/>
         <w:tblLayout w:type="fixed"/>
         <w:tblCellMar>
           <w:top w:w="55" w:type="dxa"/>
@@ -1439,14 +1439,17 @@
         </w:tblCellMar>
       </w:tblPr>
       <w:tblGrid>
-        <w:gridCol w:w="3569"/>
-        <w:gridCol w:w="4950"/>
+        <w:gridCol w:w="1872"/>
+        <w:gridCol w:w="1872"/>
+        <w:gridCol w:w="1872"/>
+        <w:gridCol w:w="2351"/>
+        <w:gridCol w:w="1450"/>
       </w:tblGrid>
       <w:tr>
         <w:trPr/>
         <w:tc>
           <w:tcPr>
-            <w:tcW w:w="3569" w:type="dxa"/>
+            <w:tcW w:w="1872" w:type="dxa"/>
             <w:tcBorders>
               <w:top w:val="single" w:sz="4" w:space="0" w:color="000000"/>
               <w:left w:val="single" w:sz="4" w:space="0" w:color="000000"/>
@@ -1467,7 +1470,70 @@
         </w:tc>
         <w:tc>
           <w:tcPr>
-            <w:tcW w:w="4950" w:type="dxa"/>
+            <w:tcW w:w="1872" w:type="dxa"/>
+            <w:tcBorders>
+              <w:top w:val="single" w:sz="4" w:space="0" w:color="000000"/>
+              <w:left w:val="single" w:sz="4" w:space="0" w:color="000000"/>
+              <w:bottom w:val="single" w:sz="4" w:space="0" w:color="000000"/>
+            </w:tcBorders>
+          </w:tcPr>
+          <w:p>
+            <w:pPr>
+              <w:pStyle w:val="Normal"/>
+              <w:spacing w:before="0" w:after="160"/>
+              <w:rPr/>
+            </w:pPr>
+            <w:r>
+              <w:rPr/>
+              <w:t>Description</w:t>
+            </w:r>
+          </w:p>
+        </w:tc>
+        <w:tc>
+          <w:tcPr>
+            <w:tcW w:w="1872" w:type="dxa"/>
+            <w:tcBorders>
+              <w:top w:val="single" w:sz="4" w:space="0" w:color="000000"/>
+              <w:left w:val="single" w:sz="4" w:space="0" w:color="000000"/>
+              <w:bottom w:val="single" w:sz="4" w:space="0" w:color="000000"/>
+            </w:tcBorders>
+          </w:tcPr>
+          <w:p>
+            <w:pPr>
+              <w:pStyle w:val="Normal"/>
+              <w:spacing w:before="0" w:after="160"/>
+              <w:rPr/>
+            </w:pPr>
+            <w:r>
+              <w:rPr/>
+              <w:t>Source Channel</w:t>
+            </w:r>
+          </w:p>
+        </w:tc>
+        <w:tc>
+          <w:tcPr>
+            <w:tcW w:w="2351" w:type="dxa"/>
+            <w:tcBorders>
+              <w:top w:val="single" w:sz="4" w:space="0" w:color="000000"/>
+              <w:left w:val="single" w:sz="4" w:space="0" w:color="000000"/>
+              <w:bottom w:val="single" w:sz="4" w:space="0" w:color="000000"/>
+            </w:tcBorders>
+          </w:tcPr>
+          <w:p>
+            <w:pPr>
+              <w:pStyle w:val="Normal"/>
+              <w:spacing w:before="0" w:after="160"/>
+              <w:rPr/>
+            </w:pPr>
+            <w:r>
+              <w:rPr/>
+              <w:t>Impacted System</w:t>
+            </w:r>
+          </w:p>
+        </w:tc>
+        <w:tc>
+          <w:tcPr>
+            <w:tcW w:w="1450" w:type="dxa"/>
             <w:tcBorders>
               <w:top w:val="single" w:sz="4" w:space="0" w:color="000000"/>
               <w:left w:val="single" w:sz="4" w:space="0" w:color="000000"/>
@@ -1483,7 +1549,7 @@
             </w:pPr>
             <w:r>
               <w:rPr/>
-              <w:t>{req_id_tm}</w:t>
+              <w:t>Outcome</w:t>
             </w:r>
           </w:p>
         </w:tc>
@@ -1492,7 +1558,7 @@
         <w:trPr/>
         <w:tc>
           <w:tcPr>
-            <w:tcW w:w="3569" w:type="dxa"/>
+            <w:tcW w:w="1872" w:type="dxa"/>
             <w:tcBorders>
               <w:left w:val="single" w:sz="4" w:space="0" w:color="000000"/>
               <w:bottom w:val="single" w:sz="4" w:space="0" w:color="000000"/>
@@ -1506,13 +1572,73 @@
             </w:pPr>
             <w:r>
               <w:rPr/>
-              <w:t>Description</w:t>
-            </w:r>
-          </w:p>
-        </w:tc>
-        <w:tc>
-          <w:tcPr>
-            <w:tcW w:w="4950" w:type="dxa"/>
+              <w:t>{req_id_tm}</w:t>
+            </w:r>
+          </w:p>
+        </w:tc>
+        <w:tc>
+          <w:tcPr>
+            <w:tcW w:w="1872" w:type="dxa"/>
+            <w:tcBorders>
+              <w:left w:val="single" w:sz="4" w:space="0" w:color="000000"/>
+              <w:bottom w:val="single" w:sz="4" w:space="0" w:color="000000"/>
+            </w:tcBorders>
+          </w:tcPr>
+          <w:p>
+            <w:pPr>
+              <w:pStyle w:val="Normal"/>
+              <w:spacing w:before="0" w:after="160"/>
+              <w:rPr/>
+            </w:pPr>
+            <w:r>
+              <w:rPr/>
+              <w:t>{description_tm}</w:t>
+            </w:r>
+          </w:p>
+        </w:tc>
+        <w:tc>
+          <w:tcPr>
+            <w:tcW w:w="1872" w:type="dxa"/>
+            <w:tcBorders>
+              <w:left w:val="single" w:sz="4" w:space="0" w:color="000000"/>
+              <w:bottom w:val="single" w:sz="4" w:space="0" w:color="000000"/>
+            </w:tcBorders>
+          </w:tcPr>
+          <w:p>
+            <w:pPr>
+              <w:pStyle w:val="Normal"/>
+              <w:spacing w:before="0" w:after="160"/>
+              <w:rPr/>
+            </w:pPr>
+            <w:r>
+              <w:rPr/>
+              <w:t>{source_channel}</w:t>
+            </w:r>
+          </w:p>
+        </w:tc>
+        <w:tc>
+          <w:tcPr>
+            <w:tcW w:w="2351" w:type="dxa"/>
+            <w:tcBorders>
+              <w:left w:val="single" w:sz="4" w:space="0" w:color="000000"/>
+              <w:bottom w:val="single" w:sz="4" w:space="0" w:color="000000"/>
+            </w:tcBorders>
+          </w:tcPr>
+          <w:p>
+            <w:pPr>
+              <w:pStyle w:val="Normal"/>
+              <w:spacing w:before="0" w:after="160"/>
+              <w:rPr/>
+            </w:pPr>
+            <w:r>
+              <w:rPr/>
+              <w:t>{impacted_system}</w:t>
+            </w:r>
+          </w:p>
+        </w:tc>
+        <w:tc>
+          <w:tcPr>
+            <w:tcW w:w="1450" w:type="dxa"/>
             <w:tcBorders>
               <w:left w:val="single" w:sz="4" w:space="0" w:color="000000"/>
               <w:bottom w:val="single" w:sz="4" w:space="0" w:color="000000"/>
@@ -1527,144 +1653,36 @@
             </w:pPr>
             <w:r>
               <w:rPr/>
-              <w:t>{description_tm}</w:t>
-            </w:r>
-          </w:p>
-        </w:tc>
-      </w:tr>
-      <w:tr>
-        <w:trPr/>
-        <w:tc>
-          <w:tcPr>
-            <w:tcW w:w="3569" w:type="dxa"/>
-            <w:tcBorders>
-              <w:left w:val="single" w:sz="4" w:space="0" w:color="000000"/>
-              <w:bottom w:val="single" w:sz="4" w:space="0" w:color="000000"/>
-            </w:tcBorders>
-          </w:tcPr>
-          <w:p>
-            <w:pPr>
-              <w:pStyle w:val="Normal"/>
-              <w:spacing w:before="0" w:after="160"/>
-              <w:rPr/>
-            </w:pPr>
-            <w:r>
-              <w:rPr/>
-              <w:t>Source Channel</w:t>
-            </w:r>
-          </w:p>
-        </w:tc>
-        <w:tc>
-          <w:tcPr>
-            <w:tcW w:w="4950" w:type="dxa"/>
-            <w:tcBorders>
-              <w:left w:val="single" w:sz="4" w:space="0" w:color="000000"/>
-              <w:bottom w:val="single" w:sz="4" w:space="0" w:color="000000"/>
-              <w:right w:val="single" w:sz="4" w:space="0" w:color="000000"/>
-            </w:tcBorders>
-          </w:tcPr>
-          <w:p>
-            <w:pPr>
-              <w:pStyle w:val="Normal"/>
-              <w:spacing w:before="0" w:after="160"/>
-              <w:rPr/>
-            </w:pPr>
-            <w:r>
-              <w:rPr/>
-              <w:t>{source_channel}</w:t>
-            </w:r>
-          </w:p>
-        </w:tc>
-      </w:tr>
-      <w:tr>
-        <w:trPr/>
-        <w:tc>
-          <w:tcPr>
-            <w:tcW w:w="3569" w:type="dxa"/>
-            <w:tcBorders>
-              <w:left w:val="single" w:sz="4" w:space="0" w:color="000000"/>
-              <w:bottom w:val="single" w:sz="4" w:space="0" w:color="000000"/>
-            </w:tcBorders>
-          </w:tcPr>
-          <w:p>
-            <w:pPr>
-              <w:pStyle w:val="Normal"/>
-              <w:spacing w:before="0" w:after="160"/>
-              <w:rPr/>
-            </w:pPr>
-            <w:r>
-              <w:rPr/>
-              <w:t>Impacted System</w:t>
-            </w:r>
-          </w:p>
-        </w:tc>
-        <w:tc>
-          <w:tcPr>
-            <w:tcW w:w="4950" w:type="dxa"/>
-            <w:tcBorders>
-              <w:left w:val="single" w:sz="4" w:space="0" w:color="000000"/>
-              <w:bottom w:val="single" w:sz="4" w:space="0" w:color="000000"/>
-              <w:right w:val="single" w:sz="4" w:space="0" w:color="000000"/>
-            </w:tcBorders>
-          </w:tcPr>
-          <w:p>
-            <w:pPr>
-              <w:pStyle w:val="Normal"/>
-              <w:spacing w:before="0" w:after="160"/>
-              <w:rPr/>
-            </w:pPr>
-            <w:r>
-              <w:rPr/>
-              <w:t>{impacted_system}</w:t>
-            </w:r>
-          </w:p>
-        </w:tc>
-      </w:tr>
-      <w:tr>
-        <w:trPr/>
-        <w:tc>
-          <w:tcPr>
-            <w:tcW w:w="3569" w:type="dxa"/>
-            <w:tcBorders>
-              <w:left w:val="single" w:sz="4" w:space="0" w:color="000000"/>
-              <w:bottom w:val="single" w:sz="4" w:space="0" w:color="000000"/>
-            </w:tcBorders>
-          </w:tcPr>
-          <w:p>
-            <w:pPr>
-              <w:pStyle w:val="Normal"/>
-              <w:spacing w:before="0" w:after="160"/>
-              <w:rPr/>
-            </w:pPr>
-            <w:r>
-              <w:rPr/>
-              <w:t>Outcome</w:t>
-            </w:r>
-          </w:p>
-        </w:tc>
-        <w:tc>
-          <w:tcPr>
-            <w:tcW w:w="4950" w:type="dxa"/>
-            <w:tcBorders>
-              <w:left w:val="single" w:sz="4" w:space="0" w:color="000000"/>
-              <w:bottom w:val="single" w:sz="4" w:space="0" w:color="000000"/>
-              <w:right w:val="single" w:sz="4" w:space="0" w:color="000000"/>
-            </w:tcBorders>
-          </w:tcPr>
-          <w:p>
-            <w:pPr>
-              <w:pStyle w:val="Normal"/>
-              <w:spacing w:before="0" w:after="160"/>
-              <w:rPr/>
-            </w:pPr>
-            <w:r>
-              <w:rPr/>
               <w:t>{outcome}</w:t>
             </w:r>
           </w:p>
         </w:tc>
       </w:tr>
     </w:tbl>
+    <w:p>
+      <w:pPr>
+        <w:pStyle w:val="Normal"/>
+        <w:rPr>
+          <w:b/>
+          <w:bCs/>
+        </w:rPr>
+      </w:pPr>
+      <w:r>
+        <w:rPr>
+          <w:b/>
+          <w:bCs/>
+        </w:rPr>
+      </w:r>
+    </w:p>
+    <w:p>
+      <w:pPr>
+        <w:pStyle w:val="Normal"/>
+        <w:rPr/>
+      </w:pPr>
+      <w:r>
+        <w:rPr/>
+      </w:r>
+    </w:p>
     <w:p>
       <w:pPr>
         <w:pStyle w:val="Normal"/>

</xml_diff>

<commit_message>
Table orientation change for the Requirement Tracebility Matrix table
</commit_message>
<xml_diff>
--- a/BRD_Template.docx
+++ b/BRD_Template.docx
@@ -178,9 +178,9 @@
           <w:tcPr>
             <w:tcW w:w="4620" w:type="dxa"/>
             <w:tcBorders>
-              <w:top w:val="single" w:sz="4" w:space="0" w:color="000000"/>
-              <w:left w:val="single" w:sz="4" w:space="0" w:color="000000"/>
-              <w:bottom w:val="single" w:sz="4" w:space="0" w:color="000000"/>
+              <w:top w:val="single" w:sz="8" w:space="0" w:color="000000"/>
+              <w:left w:val="single" w:sz="8" w:space="0" w:color="000000"/>
+              <w:bottom w:val="single" w:sz="8" w:space="0" w:color="000000"/>
             </w:tcBorders>
           </w:tcPr>
           <w:p>
@@ -199,10 +199,10 @@
           <w:tcPr>
             <w:tcW w:w="4619" w:type="dxa"/>
             <w:tcBorders>
-              <w:top w:val="single" w:sz="4" w:space="0" w:color="000000"/>
-              <w:left w:val="single" w:sz="4" w:space="0" w:color="000000"/>
-              <w:bottom w:val="single" w:sz="4" w:space="0" w:color="000000"/>
-              <w:right w:val="single" w:sz="4" w:space="0" w:color="000000"/>
+              <w:top w:val="single" w:sz="8" w:space="0" w:color="000000"/>
+              <w:left w:val="single" w:sz="8" w:space="0" w:color="000000"/>
+              <w:bottom w:val="single" w:sz="8" w:space="0" w:color="000000"/>
+              <w:right w:val="single" w:sz="8" w:space="0" w:color="000000"/>
             </w:tcBorders>
           </w:tcPr>
           <w:p>
@@ -224,8 +224,8 @@
           <w:tcPr>
             <w:tcW w:w="4620" w:type="dxa"/>
             <w:tcBorders>
-              <w:left w:val="single" w:sz="4" w:space="0" w:color="000000"/>
-              <w:bottom w:val="single" w:sz="4" w:space="0" w:color="000000"/>
+              <w:left w:val="single" w:sz="8" w:space="0" w:color="000000"/>
+              <w:bottom w:val="single" w:sz="8" w:space="0" w:color="000000"/>
             </w:tcBorders>
           </w:tcPr>
           <w:p>
@@ -244,9 +244,9 @@
           <w:tcPr>
             <w:tcW w:w="4619" w:type="dxa"/>
             <w:tcBorders>
-              <w:left w:val="single" w:sz="4" w:space="0" w:color="000000"/>
-              <w:bottom w:val="single" w:sz="4" w:space="0" w:color="000000"/>
-              <w:right w:val="single" w:sz="4" w:space="0" w:color="000000"/>
+              <w:left w:val="single" w:sz="8" w:space="0" w:color="000000"/>
+              <w:bottom w:val="single" w:sz="8" w:space="0" w:color="000000"/>
+              <w:right w:val="single" w:sz="8" w:space="0" w:color="000000"/>
             </w:tcBorders>
           </w:tcPr>
           <w:p>
@@ -1451,9 +1451,9 @@
           <w:tcPr>
             <w:tcW w:w="1872" w:type="dxa"/>
             <w:tcBorders>
-              <w:top w:val="single" w:sz="4" w:space="0" w:color="000000"/>
-              <w:left w:val="single" w:sz="4" w:space="0" w:color="000000"/>
-              <w:bottom w:val="single" w:sz="4" w:space="0" w:color="000000"/>
+              <w:top w:val="single" w:sz="8" w:space="0" w:color="000000"/>
+              <w:left w:val="single" w:sz="8" w:space="0" w:color="000000"/>
+              <w:bottom w:val="single" w:sz="8" w:space="0" w:color="000000"/>
             </w:tcBorders>
           </w:tcPr>
           <w:p>
@@ -1472,9 +1472,9 @@
           <w:tcPr>
             <w:tcW w:w="1872" w:type="dxa"/>
             <w:tcBorders>
-              <w:top w:val="single" w:sz="4" w:space="0" w:color="000000"/>
-              <w:left w:val="single" w:sz="4" w:space="0" w:color="000000"/>
-              <w:bottom w:val="single" w:sz="4" w:space="0" w:color="000000"/>
+              <w:top w:val="single" w:sz="8" w:space="0" w:color="000000"/>
+              <w:left w:val="single" w:sz="8" w:space="0" w:color="000000"/>
+              <w:bottom w:val="single" w:sz="8" w:space="0" w:color="000000"/>
             </w:tcBorders>
           </w:tcPr>
           <w:p>
@@ -1493,9 +1493,9 @@
           <w:tcPr>
             <w:tcW w:w="1872" w:type="dxa"/>
             <w:tcBorders>
-              <w:top w:val="single" w:sz="4" w:space="0" w:color="000000"/>
-              <w:left w:val="single" w:sz="4" w:space="0" w:color="000000"/>
-              <w:bottom w:val="single" w:sz="4" w:space="0" w:color="000000"/>
+              <w:top w:val="single" w:sz="8" w:space="0" w:color="000000"/>
+              <w:left w:val="single" w:sz="8" w:space="0" w:color="000000"/>
+              <w:bottom w:val="single" w:sz="8" w:space="0" w:color="000000"/>
             </w:tcBorders>
           </w:tcPr>
           <w:p>
@@ -1514,9 +1514,9 @@
           <w:tcPr>
             <w:tcW w:w="2351" w:type="dxa"/>
             <w:tcBorders>
-              <w:top w:val="single" w:sz="4" w:space="0" w:color="000000"/>
-              <w:left w:val="single" w:sz="4" w:space="0" w:color="000000"/>
-              <w:bottom w:val="single" w:sz="4" w:space="0" w:color="000000"/>
+              <w:top w:val="single" w:sz="8" w:space="0" w:color="000000"/>
+              <w:left w:val="single" w:sz="8" w:space="0" w:color="000000"/>
+              <w:bottom w:val="single" w:sz="8" w:space="0" w:color="000000"/>
             </w:tcBorders>
           </w:tcPr>
           <w:p>
@@ -1535,10 +1535,10 @@
           <w:tcPr>
             <w:tcW w:w="1450" w:type="dxa"/>
             <w:tcBorders>
-              <w:top w:val="single" w:sz="4" w:space="0" w:color="000000"/>
-              <w:left w:val="single" w:sz="4" w:space="0" w:color="000000"/>
-              <w:bottom w:val="single" w:sz="4" w:space="0" w:color="000000"/>
-              <w:right w:val="single" w:sz="4" w:space="0" w:color="000000"/>
+              <w:top w:val="single" w:sz="8" w:space="0" w:color="000000"/>
+              <w:left w:val="single" w:sz="8" w:space="0" w:color="000000"/>
+              <w:bottom w:val="single" w:sz="8" w:space="0" w:color="000000"/>
+              <w:right w:val="single" w:sz="8" w:space="0" w:color="000000"/>
             </w:tcBorders>
           </w:tcPr>
           <w:p>
@@ -1560,8 +1560,8 @@
           <w:tcPr>
             <w:tcW w:w="1872" w:type="dxa"/>
             <w:tcBorders>
-              <w:left w:val="single" w:sz="4" w:space="0" w:color="000000"/>
-              <w:bottom w:val="single" w:sz="4" w:space="0" w:color="000000"/>
+              <w:left w:val="single" w:sz="8" w:space="0" w:color="000000"/>
+              <w:bottom w:val="single" w:sz="8" w:space="0" w:color="000000"/>
             </w:tcBorders>
           </w:tcPr>
           <w:p>
@@ -1580,8 +1580,8 @@
           <w:tcPr>
             <w:tcW w:w="1872" w:type="dxa"/>
             <w:tcBorders>
-              <w:left w:val="single" w:sz="4" w:space="0" w:color="000000"/>
-              <w:bottom w:val="single" w:sz="4" w:space="0" w:color="000000"/>
+              <w:left w:val="single" w:sz="8" w:space="0" w:color="000000"/>
+              <w:bottom w:val="single" w:sz="8" w:space="0" w:color="000000"/>
             </w:tcBorders>
           </w:tcPr>
           <w:p>
@@ -1600,8 +1600,8 @@
           <w:tcPr>
             <w:tcW w:w="1872" w:type="dxa"/>
             <w:tcBorders>
-              <w:left w:val="single" w:sz="4" w:space="0" w:color="000000"/>
-              <w:bottom w:val="single" w:sz="4" w:space="0" w:color="000000"/>
+              <w:left w:val="single" w:sz="8" w:space="0" w:color="000000"/>
+              <w:bottom w:val="single" w:sz="8" w:space="0" w:color="000000"/>
             </w:tcBorders>
           </w:tcPr>
           <w:p>
@@ -1620,8 +1620,8 @@
           <w:tcPr>
             <w:tcW w:w="2351" w:type="dxa"/>
             <w:tcBorders>
-              <w:left w:val="single" w:sz="4" w:space="0" w:color="000000"/>
-              <w:bottom w:val="single" w:sz="4" w:space="0" w:color="000000"/>
+              <w:left w:val="single" w:sz="8" w:space="0" w:color="000000"/>
+              <w:bottom w:val="single" w:sz="8" w:space="0" w:color="000000"/>
             </w:tcBorders>
           </w:tcPr>
           <w:p>
@@ -1640,9 +1640,9 @@
           <w:tcPr>
             <w:tcW w:w="1450" w:type="dxa"/>
             <w:tcBorders>
-              <w:left w:val="single" w:sz="4" w:space="0" w:color="000000"/>
-              <w:bottom w:val="single" w:sz="4" w:space="0" w:color="000000"/>
-              <w:right w:val="single" w:sz="4" w:space="0" w:color="000000"/>
+              <w:left w:val="single" w:sz="8" w:space="0" w:color="000000"/>
+              <w:bottom w:val="single" w:sz="8" w:space="0" w:color="000000"/>
+              <w:right w:val="single" w:sz="8" w:space="0" w:color="000000"/>
             </w:tcBorders>
           </w:tcPr>
           <w:p>

</xml_diff>

<commit_message>
feat: enhance BRD template with process diagram support and metadata improvements
Added process diagram field to BRD template structure and improved metadata handling for generated business requirement documents. The template now supports comprehensive process visualization documentation alongside existing requirement sections.
</commit_message>
<xml_diff>
--- a/BRD_Template.docx
+++ b/BRD_Template.docx
@@ -2150,7 +2150,7 @@
       </w:r>
       <w:r>
         <w:rPr/>
-        <w:t xml:space="preserve"> {training_requirement}</w:t>
+        <w:t xml:space="preserve"> {training_requirement} </w:t>
       </w:r>
     </w:p>
     <w:p>
@@ -2203,6 +2203,47 @@
       <w:r>
         <w:rPr/>
         <w:t xml:space="preserve"> {contradictions_found_in_input_documents}</w:t>
+      </w:r>
+    </w:p>
+    <w:p>
+      <w:pPr>
+        <w:pStyle w:val="Normal"/>
+        <w:rPr/>
+      </w:pPr>
+      <w:r>
+        <w:rPr/>
+      </w:r>
+    </w:p>
+    <w:p>
+      <w:pPr>
+        <w:pStyle w:val="Normal"/>
+        <w:rPr>
+          <w:b/>
+          <w:bCs/>
+        </w:rPr>
+      </w:pPr>
+      <w:r>
+        <w:rPr>
+          <w:b/>
+          <w:bCs/>
+        </w:rPr>
+      </w:r>
+    </w:p>
+    <w:p>
+      <w:pPr>
+        <w:pStyle w:val="Normal"/>
+        <w:rPr/>
+      </w:pPr>
+      <w:r>
+        <w:rPr>
+          <w:b/>
+          <w:bCs/>
+        </w:rPr>
+        <w:t>Process Diagram:</w:t>
+      </w:r>
+      <w:r>
+        <w:rPr/>
+        <w:t xml:space="preserve"> {process_diagram}</w:t>
       </w:r>
     </w:p>
     <w:p>

</xml_diff>